<commit_message>
Arbeidsavtale-mal: hold overskrifter og signaturblokk sammen med neste avsnitt
keepNext/keepLines paa Title, Heading 1 og Heading 2, paa mellomtitlene
(Arbeidsgiver, Arbeidstaker, Pensjonsavtaler, Forsikringsavtaler) og paa hele
signaturblokken, saa en overskrift aldri staar alene nederst paa en side.
Verifisert i DocuSigns egen PDF-tegning: "9 Oppsigelse" staar naa foerst paa side 4.
Alle [[...]]-ankre er uendret.

Co-Authored-By: Claude Sonnet 5.5 <noreply@anthropic.com>
</commit_message>
<xml_diff>
--- a/docs/Arbeidsavtale-mal.docx
+++ b/docs/Arbeidsavtale-mal.docx
@@ -26,6 +26,8 @@
     </w:p>
     <w:p>
       <w:pPr>
+        <w:keepNext/>
+        <w:keepLines/>
         <w:spacing w:after="120"/>
       </w:pPr>
       <w:r>
@@ -260,6 +262,8 @@
     </w:p>
     <w:p>
       <w:pPr>
+        <w:keepNext/>
+        <w:keepLines/>
         <w:spacing w:after="120"/>
       </w:pPr>
       <w:r>
@@ -862,6 +866,8 @@
     </w:p>
     <w:p>
       <w:pPr>
+        <w:keepNext/>
+        <w:keepLines/>
         <w:spacing w:after="240" w:line="360"/>
       </w:pPr>
       <w:r>
@@ -870,6 +876,8 @@
     </w:p>
     <w:p>
       <w:pPr>
+        <w:keepNext/>
+        <w:keepLines/>
         <w:spacing w:after="240" w:line="360"/>
       </w:pPr>
       <w:r>
@@ -886,6 +894,8 @@
     </w:p>
     <w:p>
       <w:pPr>
+        <w:keepNext/>
+        <w:keepLines/>
         <w:spacing w:after="240" w:line="360"/>
       </w:pPr>
       <w:r>
@@ -1195,6 +1205,10 @@
       </w:r>
     </w:p>
     <w:p>
+      <w:pPr>
+        <w:keepNext/>
+        <w:keepLines/>
+      </w:pPr>
       <w:r>
         <w:rPr>
           <w:b/>
@@ -1203,12 +1217,20 @@
       </w:r>
     </w:p>
     <w:p>
+      <w:pPr>
+        <w:keepNext/>
+        <w:keepLines/>
+      </w:pPr>
       <w:r>
         <w:rPr/>
         <w:t xml:space="preserve"/>
       </w:r>
     </w:p>
     <w:p>
+      <w:pPr>
+        <w:keepNext/>
+        <w:keepLines/>
+      </w:pPr>
       <w:r>
         <w:rPr>
           <w:b/>
@@ -1217,24 +1239,40 @@
       </w:r>
     </w:p>
     <w:p>
+      <w:pPr>
+        <w:keepNext/>
+        <w:keepLines/>
+      </w:pPr>
       <w:r>
         <w:rPr/>
         <w:t xml:space="preserve">v/ Daniel Kolstad, Daglig leder</w:t>
       </w:r>
     </w:p>
     <w:p>
+      <w:pPr>
+        <w:keepNext/>
+        <w:keepLines/>
+      </w:pPr>
       <w:r>
         <w:rPr/>
         <w:t xml:space="preserve"/>
       </w:r>
     </w:p>
     <w:p>
+      <w:pPr>
+        <w:keepNext/>
+        <w:keepLines/>
+      </w:pPr>
       <w:r>
         <w:rPr/>
         <w:t xml:space="preserve"/>
       </w:r>
     </w:p>
     <w:p>
+      <w:pPr>
+        <w:keepNext/>
+        <w:keepLines/>
+      </w:pPr>
       <w:r>
         <w:rPr>
           <w:color w:val="FFFFFF"/>
@@ -1243,18 +1281,30 @@
       </w:r>
     </w:p>
     <w:p>
+      <w:pPr>
+        <w:keepNext/>
+        <w:keepLines/>
+      </w:pPr>
       <w:r>
         <w:rPr/>
         <w:t xml:space="preserve"/>
       </w:r>
     </w:p>
     <w:p>
+      <w:pPr>
+        <w:keepNext/>
+        <w:keepLines/>
+      </w:pPr>
       <w:r>
         <w:rPr/>
         <w:t xml:space="preserve"/>
       </w:r>
     </w:p>
     <w:p>
+      <w:pPr>
+        <w:keepNext/>
+        <w:keepLines/>
+      </w:pPr>
       <w:r>
         <w:rPr/>
         <w:t xml:space="preserve">Dato: </w:t>
@@ -1267,24 +1317,40 @@
       </w:r>
     </w:p>
     <w:p>
+      <w:pPr>
+        <w:keepNext/>
+        <w:keepLines/>
+      </w:pPr>
       <w:r>
         <w:rPr/>
         <w:t xml:space="preserve"/>
       </w:r>
     </w:p>
     <w:p>
+      <w:pPr>
+        <w:keepNext/>
+        <w:keepLines/>
+      </w:pPr>
       <w:r>
         <w:rPr/>
         <w:t xml:space="preserve"/>
       </w:r>
     </w:p>
     <w:p>
+      <w:pPr>
+        <w:keepNext/>
+        <w:keepLines/>
+      </w:pPr>
       <w:r>
         <w:rPr/>
         <w:t xml:space="preserve"/>
       </w:r>
     </w:p>
     <w:p>
+      <w:pPr>
+        <w:keepNext/>
+        <w:keepLines/>
+      </w:pPr>
       <w:r>
         <w:rPr>
           <w:b/>
@@ -1293,18 +1359,30 @@
       </w:r>
     </w:p>
     <w:p>
+      <w:pPr>
+        <w:keepNext/>
+        <w:keepLines/>
+      </w:pPr>
       <w:r>
         <w:rPr/>
         <w:t xml:space="preserve"/>
       </w:r>
     </w:p>
     <w:p>
+      <w:pPr>
+        <w:keepNext/>
+        <w:keepLines/>
+      </w:pPr>
       <w:r>
         <w:rPr/>
         <w:t xml:space="preserve"/>
       </w:r>
     </w:p>
     <w:p>
+      <w:pPr>
+        <w:keepNext/>
+        <w:keepLines/>
+      </w:pPr>
       <w:r>
         <w:rPr>
           <w:color w:val="FFFFFF"/>
@@ -1313,12 +1391,20 @@
       </w:r>
     </w:p>
     <w:p>
+      <w:pPr>
+        <w:keepNext/>
+        <w:keepLines/>
+      </w:pPr>
       <w:r>
         <w:rPr/>
         <w:t xml:space="preserve"/>
       </w:r>
     </w:p>
     <w:p>
+      <w:pPr>
+        <w:keepNext/>
+        <w:keepLines/>
+      </w:pPr>
       <w:r>
         <w:rPr/>
         <w:t xml:space="preserve"/>
@@ -1530,6 +1616,10 @@
     <w:basedOn w:val="Normal"/>
     <w:next w:val="Normal"/>
     <w:qFormat/>
+    <w:pPr>
+      <w:keepNext/>
+      <w:keepLines/>
+    </w:pPr>
     <w:rPr>
       <w:sz w:val="56"/>
       <w:szCs w:val="56"/>
@@ -1540,6 +1630,10 @@
     <w:basedOn w:val="Normal"/>
     <w:next w:val="Normal"/>
     <w:qFormat/>
+    <w:pPr>
+      <w:keepNext/>
+      <w:keepLines/>
+    </w:pPr>
     <w:rPr>
       <w:color w:val="2E74B5"/>
       <w:sz w:val="32"/>
@@ -1551,6 +1645,10 @@
     <w:basedOn w:val="Normal"/>
     <w:next w:val="Normal"/>
     <w:qFormat/>
+    <w:pPr>
+      <w:keepNext/>
+      <w:keepLines/>
+    </w:pPr>
     <w:rPr>
       <w:color w:val="2E74B5"/>
       <w:sz w:val="26"/>

</xml_diff>